<commit_message>
Sprint 2: MVP, relatório, documentação, dados e painel
- MVP/sp2.md e RELATORIO_SPRINT_2.md
- README da raiz e de observatorio-sjc atualizados para a Sprint 2
- docs/ atualizados (00 a 10, Anexo 8 da Sprint 2); removida a cópia 08-Relatorio-Anexo8-Sprint-1
- dados/: base única RAIS_SJC_2024_PowerBI.csv e planilhas tratadas
- powerbi/: PowerbiATT_Api_Sprint2.pbix
- evidencias/: guia de importação e gráfico por região

Co-Authored-By: Claude Opus 5.5 <noreply@anthropic.com>
Claude-Session: https://claude.ai/code/session_01HUz7NUV56knFZTUTEzRM5d
</commit_message>
<xml_diff>
--- a/observatorio-sjc/docs/01-Visao-e-Escopo.docx
+++ b/observatorio-sjc/docs/01-Visao-e-Escopo.docx
@@ -98,20 +98,20 @@
         <w:spacing w:after="60"/>
       </w:pPr>
       <w:r>
-        <w:t xml:space="preserve">Professor P2: Marcus Nascimento</w:t>
-      </w:r>
-    </w:p>
-    <w:p>
-      <w:pPr>
-        <w:pStyle w:val="PargrafodaLista"/>
-        <w:numPr>
-          <w:ilvl w:val="0"/>
-          <w:numId w:val="1"/>
-        </w:numPr>
-        <w:spacing w:after="60"/>
-      </w:pPr>
-      <w:r>
-        <w:t xml:space="preserve">Contato do cliente: Marcus Nascimento, via grupo do WhatsApp</w:t>
+        <w:t>Professor P2: Marcus</w:t>
+      </w:r>
+    </w:p>
+    <w:p>
+      <w:pPr>
+        <w:pStyle w:val="PargrafodaLista"/>
+        <w:numPr>
+          <w:ilvl w:val="0"/>
+          <w:numId w:val="1"/>
+        </w:numPr>
+        <w:spacing w:after="60"/>
+      </w:pPr>
+      <w:r>
+        <w:t>Contato do cliente: Marcus, via grupo do WhatsApp</w:t>
       </w:r>
     </w:p>
     <w:p>
@@ -254,7 +254,7 @@
         <w:spacing w:after="60"/>
       </w:pPr>
       <w:r>
-        <w:t>Permitir filtros por período e por setor de atividade</w:t>
+        <w:t xml:space="preserve">Permitir filtros por setor de atividade, porte, tipo de estabelecimento e região oficial do município (a RAIS disponível cobre só 2024; filtro por período depende de bases de outros anos)</w:t>
       </w:r>
     </w:p>
     <w:p>
@@ -374,7 +374,7 @@
         <w:spacing w:after="60"/>
       </w:pPr>
       <w:r>
-        <w:t>Filtros por período (ano/mês) e por setor</w:t>
+        <w:t xml:space="preserve">Filtros por setor, porte, tipo de estabelecimento e região (período: só 2024 nesta versão da base)</w:t>
       </w:r>
     </w:p>
     <w:p>
@@ -520,21 +520,20 @@
         <w:spacing w:after="60"/>
       </w:pPr>
       <w:r>
-        <w:lastRenderedPageBreak/>
-        <w:t>PIB municipal por setor segue a periodicidade de divulgação do IBGE; a série mais recente disponível é 2022–2023, gerando uma defasagem de 1 ano em relação à RAIS 2024, documentada como limitação metodológica (ver 06-Decisoes-de-Dados)</w:t>
-      </w:r>
-    </w:p>
-    <w:p>
-      <w:pPr>
-        <w:pStyle w:val="PargrafodaLista"/>
-        <w:numPr>
-          <w:ilvl w:val="0"/>
-          <w:numId w:val="1"/>
-        </w:numPr>
-        <w:spacing w:after="60"/>
-      </w:pPr>
-      <w:r>
-        <w:t>A RAIS não fornece coordenadas geográficas prontas das empresas — o mapeamento geográfico dependerá do nível de detalhe disponível (CEP/bairro/distrito) e de eventual complementação com fontes públicas adicionais</w:t>
+        <w:t xml:space="preserve">PIB municipal segue a periodicidade de divulgação do IBGE: o PIB total vai até 2023, mas o valor adicionado por setor só até 2021 (mudança de referência das Contas Nacionais). O cruzamento por setor compara valor adicionado de 2021 com emprego de 2024 (ver 06-Decisoes-de-Dados)</w:t>
+      </w:r>
+    </w:p>
+    <w:p>
+      <w:pPr>
+        <w:pStyle w:val="PargrafodaLista"/>
+        <w:numPr>
+          <w:ilvl w:val="0"/>
+          <w:numId w:val="1"/>
+        </w:numPr>
+        <w:spacing w:after="60"/>
+      </w:pPr>
+      <w:r>
+        <w:t xml:space="preserve">A RAIS não fornece coordenadas das empresas: na Sprint 2 o CEP foi geocodificado no nível de bairro (78% dos estabelecimentos com ponto no mapa) e cada estabelecimento recebeu a região oficial do município (99,99%). A lista oficial de bairros da Região Norte ainda depende da Prefeitura (DEC-015)</w:t>
       </w:r>
     </w:p>
     <w:p>
@@ -746,7 +745,7 @@
                 <w:b/>
                 <w:bCs/>
               </w:rPr>
-              <w:t>Risco</w:t>
+              <w:t xml:space="preserve">Risco</w:t>
             </w:r>
           </w:p>
         </w:tc>
@@ -774,7 +773,7 @@
                 <w:b/>
                 <w:bCs/>
               </w:rPr>
-              <w:t>Mitigação</w:t>
+              <w:t xml:space="preserve">Mitigação</w:t>
             </w:r>
           </w:p>
         </w:tc>
@@ -806,7 +805,10 @@
           </w:tcPr>
           <w:p>
             <w:r>
-              <w:t>Volume grande de microdados da RAIS pode ser difícil de processar</w:t>
+              <w:rPr>
+                <w:b w:val="false"/>
+              </w:rPr>
+              <w:t xml:space="preserve">Volume grande de microdados da RAIS pode ser difícil de processar</w:t>
             </w:r>
           </w:p>
         </w:tc>
@@ -830,7 +832,10 @@
           </w:tcPr>
           <w:p>
             <w:r>
-              <w:t>Filtrar por município (SJC) o quanto antes no processo de ETL, usando Google Colab/Python — feito via leitura em streaming (Sprint 1)</w:t>
+              <w:rPr>
+                <w:b w:val="false"/>
+              </w:rPr>
+              <w:t xml:space="preserve">Filtrar por município (SJC) o quanto antes no processo de ETL, usando Google Colab/Python — feito via leitura em streaming (Sprint 1)</w:t>
             </w:r>
           </w:p>
         </w:tc>
@@ -862,7 +867,10 @@
           </w:tcPr>
           <w:p>
             <w:r>
-              <w:t>Defasagem entre a divulgação da RAIS e do PIB municipal</w:t>
+              <w:rPr>
+                <w:b w:val="false"/>
+              </w:rPr>
+              <w:t xml:space="preserve">Defasagem entre a divulgação da RAIS e do PIB municipal</w:t>
             </w:r>
           </w:p>
         </w:tc>
@@ -886,7 +894,10 @@
           </w:tcPr>
           <w:p>
             <w:r>
-              <w:t>Usar o último ano disponível em ambas as bases (RAIS 2024 x PIB 2023) e documentar a defasagem de 1 ano (DEC-005)</w:t>
+              <w:rPr>
+                <w:b w:val="false"/>
+              </w:rPr>
+              <w:t xml:space="preserve">Usar o último ano disponível em cada base (RAIS 2024, PIB 2023, valor adicionado por setor 2021) e mostrar o ano de cada número no painel (DEC-005, DEC-006/009)</w:t>
             </w:r>
           </w:p>
         </w:tc>
@@ -918,7 +929,10 @@
           </w:tcPr>
           <w:p>
             <w:r>
-              <w:t>Dificuldade em estimar participação de empresa individual no PIB (dado é por setor, não por empresa)</w:t>
+              <w:rPr>
+                <w:b w:val="false"/>
+              </w:rPr>
+              <w:t xml:space="preserve">Dificuldade em estimar participação de empresa individual no PIB (dado é por setor, não por empresa)</w:t>
             </w:r>
           </w:p>
         </w:tc>
@@ -942,7 +956,10 @@
           </w:tcPr>
           <w:p>
             <w:r>
-              <w:t>Deixar claro que a estimativa é por setor de atividade (CNAE), não por empresa isolada</w:t>
+              <w:rPr>
+                <w:b w:val="false"/>
+              </w:rPr>
+              <w:t xml:space="preserve">Deixar claro que a estimativa é por setor de atividade (CNAE), não por empresa isolada</w:t>
             </w:r>
           </w:p>
         </w:tc>
@@ -974,7 +991,10 @@
           </w:tcPr>
           <w:p>
             <w:r>
-              <w:t>Tentar replicar o escopo completo do Observatório da Inovação RS (equipe estadual dedicada, múltiplas fontes como editais da Fapergs)</w:t>
+              <w:rPr>
+                <w:b w:val="false"/>
+              </w:rPr>
+              <w:t xml:space="preserve">Tentar replicar o escopo completo do Observatório da Inovação RS (equipe estadual dedicada, múltiplas fontes como editais da Fapergs)</w:t>
             </w:r>
           </w:p>
         </w:tc>
@@ -998,7 +1018,10 @@
           </w:tcPr>
           <w:p>
             <w:r>
-              <w:t>Usar o Observatório RS apenas como inspiração de formato/UX; manter o escopo de dados restrito a RAIS + PIB dos Municípios (IBGE)</w:t>
+              <w:rPr>
+                <w:b w:val="false"/>
+              </w:rPr>
+              <w:t xml:space="preserve">Usar o Observatório RS apenas como inspiração de formato/UX; manter o escopo de dados restrito a RAIS + PIB dos Municípios (IBGE)</w:t>
             </w:r>
           </w:p>
         </w:tc>
@@ -1030,7 +1053,10 @@
           </w:tcPr>
           <w:p>
             <w:r>
-              <w:t>Falta de dado estruturado sobre localização exata (endereço/coordenadas) das empresas na RAIS</w:t>
+              <w:rPr>
+                <w:b w:val="false"/>
+              </w:rPr>
+              <w:t xml:space="preserve">Falta de dado estruturado sobre localização exata (endereço/coordenadas) das empresas na RAIS</w:t>
             </w:r>
           </w:p>
         </w:tc>
@@ -1054,13 +1080,147 @@
           </w:tcPr>
           <w:p>
             <w:r>
-              <w:t>Utilizar o CEP disponível na RAIS para geocodificação, documentando a limitação</w:t>
+              <w:rPr>
+                <w:b w:val="false"/>
+              </w:rPr>
+              <w:t xml:space="preserve">Geocodificação por CEP no nível de bairro e classificação por região oficial (Sprint 2); pontos com problema marcados na base (DEC-015 a DEC-018)</w:t>
+            </w:r>
+          </w:p>
+        </w:tc>
+      </w:tr>
+      <w:tr>
+        <w:tblPrEx>
+          <w:tblCellMar>
+            <w:top w:w="0" w:type="dxa"/>
+            <w:bottom w:w="0" w:type="dxa"/>
+          </w:tblCellMar>
+        </w:tblPrEx>
+        <w:tc>
+          <w:tcPr>
+            <w:tcW w:w="3800" w:type="dxa"/>
+            <w:tcBorders>
+              <w:top w:val="none" w:sz="0" w:space="0" w:color="FFFFFF"/>
+              <w:left w:val="none" w:sz="0" w:space="0" w:color="FFFFFF"/>
+              <w:bottom w:val="single" w:sz="2" w:space="0" w:color="D9D9D9"/>
+              <w:right w:val="none" w:sz="0" w:space="0" w:color="FFFFFF"/>
+            </w:tcBorders>
+            <w:shd w:val="clear" w:color="auto" w:fill="FFFFFF"/>
+            <w:tcMar>
+              <w:top w:w="80" w:type="dxa"/>
+              <w:left w:w="100" w:type="dxa"/>
+              <w:bottom w:w="80" w:type="dxa"/>
+              <w:right w:w="100" w:type="dxa"/>
+            </w:tcMar>
+            <w:vAlign w:val="center"/>
+          </w:tcPr>
+          <w:p>
+            <w:r>
+              <w:rPr>
+                <w:b w:val="false"/>
+              </w:rPr>
+              <w:t xml:space="preserve">Divisão regional oficial incompleta nas fontes públicas (bairros da Região Norte fora do Plano Diretor)</w:t>
+            </w:r>
+          </w:p>
+        </w:tc>
+        <w:tc>
+          <w:tcPr>
+            <w:tcW w:w="5400" w:type="dxa"/>
+            <w:tcBorders>
+              <w:top w:val="none" w:sz="0" w:space="0" w:color="FFFFFF"/>
+              <w:left w:val="none" w:sz="0" w:space="0" w:color="FFFFFF"/>
+              <w:bottom w:val="single" w:sz="2" w:space="0" w:color="D9D9D9"/>
+              <w:right w:val="none" w:sz="0" w:space="0" w:color="FFFFFF"/>
+            </w:tcBorders>
+            <w:shd w:val="clear" w:color="auto" w:fill="FFFFFF"/>
+            <w:tcMar>
+              <w:top w:w="80" w:type="dxa"/>
+              <w:left w:w="100" w:type="dxa"/>
+              <w:bottom w:w="80" w:type="dxa"/>
+              <w:right w:w="100" w:type="dxa"/>
+            </w:tcMar>
+            <w:vAlign w:val="center"/>
+          </w:tcPr>
+          <w:p>
+            <w:r>
+              <w:rPr>
+                <w:b w:val="false"/>
+              </w:rPr>
+              <w:t xml:space="preserve">Lista do Plano Diretor + setor do CEP, com coluna de confiabilidade; pedir ao cliente a tabela bairro → região ou o shapefile das regiões (DEC-015)</w:t>
+            </w:r>
+          </w:p>
+        </w:tc>
+      </w:tr>
+      <w:tr>
+        <w:tblPrEx>
+          <w:tblCellMar>
+            <w:top w:w="0" w:type="dxa"/>
+            <w:bottom w:w="0" w:type="dxa"/>
+          </w:tblCellMar>
+        </w:tblPrEx>
+        <w:tc>
+          <w:tcPr>
+            <w:tcW w:w="3800" w:type="dxa"/>
+            <w:tcBorders>
+              <w:top w:val="none" w:sz="0" w:space="0" w:color="FFFFFF"/>
+              <w:left w:val="none" w:sz="0" w:space="0" w:color="FFFFFF"/>
+              <w:bottom w:val="single" w:sz="2" w:space="0" w:color="D9D9D9"/>
+              <w:right w:val="none" w:sz="0" w:space="0" w:color="FFFFFF"/>
+            </w:tcBorders>
+            <w:shd w:val="clear" w:color="auto" w:fill="FFFFFF"/>
+            <w:tcMar>
+              <w:top w:w="80" w:type="dxa"/>
+              <w:left w:w="100" w:type="dxa"/>
+              <w:bottom w:w="80" w:type="dxa"/>
+              <w:right w:w="100" w:type="dxa"/>
+            </w:tcMar>
+            <w:vAlign w:val="center"/>
+          </w:tcPr>
+          <w:p>
+            <w:r>
+              <w:rPr>
+                <w:b w:val="false"/>
+              </w:rPr>
+              <w:t xml:space="preserve">A RAIS disponível tem um só ano e não traz datas de admissão — limita “setores em alta” (US08) e “contratações recentes” (US10)</w:t>
+            </w:r>
+          </w:p>
+        </w:tc>
+        <w:tc>
+          <w:tcPr>
+            <w:tcW w:w="5400" w:type="dxa"/>
+            <w:tcBorders>
+              <w:top w:val="none" w:sz="0" w:space="0" w:color="FFFFFF"/>
+              <w:left w:val="none" w:sz="0" w:space="0" w:color="FFFFFF"/>
+              <w:bottom w:val="single" w:sz="2" w:space="0" w:color="D9D9D9"/>
+              <w:right w:val="none" w:sz="0" w:space="0" w:color="FFFFFF"/>
+            </w:tcBorders>
+            <w:shd w:val="clear" w:color="auto" w:fill="FFFFFF"/>
+            <w:tcMar>
+              <w:top w:w="80" w:type="dxa"/>
+              <w:left w:w="100" w:type="dxa"/>
+              <w:bottom w:w="80" w:type="dxa"/>
+              <w:right w:w="100" w:type="dxa"/>
+            </w:tcMar>
+            <w:vAlign w:val="center"/>
+          </w:tcPr>
+          <w:p>
+            <w:r>
+              <w:rPr>
+                <w:b w:val="false"/>
+              </w:rPr>
+              <w:t xml:space="preserve">Mostrar setores predominantes; avaliar com o cliente o uso da RAIS de anos anteriores ou da RAIS Vínculos na Sprint 3</w:t>
             </w:r>
           </w:p>
         </w:tc>
       </w:tr>
     </w:tbl>
-    <w:p/>
+    <w:p>
+      <w:pPr>
+        <w:spacing w:after="160"/>
+      </w:pPr>
+      <w:r>
+        <w:t xml:space="preserve">Revisão de 26/10/2026 (fechamento da Sprint 2): ajustados os objetivos e o escopo de filtros (base com um único ano), as restrições de dados (valor adicionado por setor até 2021; geocodificação e região oficial) e incluídos dois riscos novos.</w:t>
+      </w:r>
+    </w:p>
     <w:sectPr>
       <w:footerReference w:type="default" r:id="rId7"/>
       <w:pgSz w:w="11906" w:h="16838"/>

</xml_diff>